<commit_message>
Add overdue-days display, Guión task flag, and update user manual
- Show days-overdue in red on the event's task tab, Tareas de Boda list,
  and add an "Atrasadas" filter there
- Add editable Task.is_guion field (checkbox in the task form), replacing
  the itinerary_session-derived badge; backfill existing linked tasks
- Minuto a minuto report: add a real "Guión" toggle filter that trims the
  related-tasks list to only guion-flagged tasks
- Update the user manual to document all of this session's changes
  (overdue days, Guión checkbox/filter, salida ordering, flow icon)

Co-Authored-By: Claude Sonnet 5 <noreply@anthropic.com>
</commit_message>
<xml_diff>
--- a/docs/Manual_Usuario_EventPlanner.docx
+++ b/docs/Manual_Usuario_EventPlanner.docx
@@ -1,5 +1,29 @@
 
-<file path=word/document.xml><?xml version="1.0" encoding="utf-8"?>
+<file path=docProps\app.xml><?xml version="1.0" encoding="utf-8"?>
+<Properties xmlns="http://schemas.openxmlformats.org/officeDocument/2006/extended-properties" xmlns:vt="http://schemas.openxmlformats.org/officeDocument/2006/docPropsVTypes"/>
+</file>
+
+<file path=docProps\core.xml><?xml version="1.0" encoding="utf-8"?>
+<cp:coreProperties xmlns:cp="http://schemas.openxmlformats.org/package/2006/metadata/core-properties" xmlns:dc="http://purl.org/dc/elements/1.1/" xmlns:dcterms="http://purl.org/dc/terms/" xmlns:dcmitype="http://purl.org/dc/dcmitype/" xmlns:xsi="http://www.w3.org/2001/XMLSchema-instance">
+  <dc:title>Manual de Usuario — EventPlanner</dc:title>
+  <dc:creator>EventPlanner</dc:creator>
+  <dc:description>Manual de usuario del sistema EventPlanner para Bodas Aurora Eventos</dc:description>
+  <cp:lastModifiedBy>Un-named</cp:lastModifiedBy>
+  <cp:revision>1</cp:revision>
+  <dcterms:created xsi:type="dcterms:W3CDTF">2026-07-21T03:38:39.162Z</dcterms:created>
+  <dcterms:modified xsi:type="dcterms:W3CDTF">2026-07-21T03:38:39.163Z</dcterms:modified>
+</cp:coreProperties>
+</file>
+
+<file path=docProps\custom.xml><?xml version="1.0" encoding="utf-8"?>
+<Properties xmlns="http://schemas.openxmlformats.org/officeDocument/2006/custom-properties" xmlns:vt="http://schemas.openxmlformats.org/officeDocument/2006/docPropsVTypes"/>
+</file>
+
+<file path=word\comments.xml><?xml version="1.0" encoding="utf-8"?>
+<w:comments xmlns:cx="http://schemas.microsoft.com/office/drawing/2014/chartex" xmlns:cx1="http://schemas.microsoft.com/office/drawing/2015/9/8/chartex" xmlns:cx2="http://schemas.microsoft.com/office/drawing/2015/10/21/chartex" xmlns:cx3="http://schemas.microsoft.com/office/drawing/2016/5/9/chartex" xmlns:cx4="http://schemas.microsoft.com/office/drawing/2016/5/10/chartex" xmlns:cx5="http://schemas.microsoft.com/office/drawing/2016/5/11/chartex" xmlns:cx6="http://schemas.microsoft.com/office/drawing/2016/5/12/chartex" xmlns:cx7="http://schemas.microsoft.com/office/drawing/2016/5/13/chartex" xmlns:cx8="http://schemas.microsoft.com/office/drawing/2016/5/14/chartex" xmlns:mc="http://schemas.openxmlformats.org/markup-compatibility/2006" xmlns:aink="http://schemas.microsoft.com/office/drawing/2016/ink" xmlns:am3d="http://schemas.microsoft.com/office/drawing/2017/model3d" xmlns:o="urn:schemas-microsoft-com:office:office" xmlns:r="http://schemas.openxmlformats.org/officeDocument/2006/relationships" xmlns:m="http://schemas.openxmlformats.org/officeDocument/2006/math" xmlns:v="urn:schemas-microsoft-com:vml" xmlns:wp14="http://schemas.microsoft.com/office/word/2010/wordprocessingDrawing" xmlns:wp="http://schemas.openxmlformats.org/drawingml/2006/wordprocessingDrawing" xmlns:w10="urn:schemas-microsoft-com:office:word" xmlns:w="http://schemas.openxmlformats.org/wordprocessingml/2006/main" xmlns:w14="http://schemas.microsoft.com/office/word/2010/wordml" xmlns:w15="http://schemas.microsoft.com/office/word/2012/wordml" xmlns:w16cex="http://schemas.microsoft.com/office/word/2018/wordml/cex" xmlns:w16cid="http://schemas.microsoft.com/office/word/2016/wordml/cid" xmlns:w16="http://schemas.microsoft.com/office/word/2018/wordml" xmlns:w16sdtdh="http://schemas.microsoft.com/office/word/2020/wordml/sdtdatahash" xmlns:w16se="http://schemas.microsoft.com/office/word/2015/wordml/symex" xmlns:wpg="http://schemas.microsoft.com/office/word/2010/wordprocessingGroup" xmlns:wpi="http://schemas.microsoft.com/office/word/2010/wordprocessingInk" xmlns:wne="http://schemas.microsoft.com/office/word/2006/wordml" xmlns:wps="http://schemas.microsoft.com/office/word/2010/wordprocessingShape"/>
+</file>
+
+<file path=word\document.xml><?xml version="1.0" encoding="utf-8"?>
 <w:document xmlns:wpc="http://schemas.microsoft.com/office/word/2010/wordprocessingCanvas" xmlns:mc="http://schemas.openxmlformats.org/markup-compatibility/2006" xmlns:o="urn:schemas-microsoft-com:office:office" xmlns:r="http://schemas.openxmlformats.org/officeDocument/2006/relationships" xmlns:m="http://schemas.openxmlformats.org/officeDocument/2006/math" xmlns:v="urn:schemas-microsoft-com:vml" xmlns:wp14="http://schemas.microsoft.com/office/word/2010/wordprocessingDrawing" xmlns:wp="http://schemas.openxmlformats.org/drawingml/2006/wordprocessingDrawing" xmlns:w10="urn:schemas-microsoft-com:office:word" xmlns:w="http://schemas.openxmlformats.org/wordprocessingml/2006/main" xmlns:w14="http://schemas.microsoft.com/office/word/2010/wordml" xmlns:w15="http://schemas.microsoft.com/office/word/2012/wordml" xmlns:wpg="http://schemas.microsoft.com/office/word/2010/wordprocessingGroup" xmlns:wpi="http://schemas.microsoft.com/office/word/2010/wordprocessingInk" xmlns:wne="http://schemas.microsoft.com/office/word/2006/wordml" xmlns:wps="http://schemas.microsoft.com/office/word/2010/wordprocessingShape" xmlns:cx="http://schemas.microsoft.com/office/drawing/2014/chartex" xmlns:cx1="http://schemas.microsoft.com/office/drawing/2015/9/8/chartex" xmlns:cx2="http://schemas.microsoft.com/office/drawing/2015/10/21/chartex" xmlns:cx3="http://schemas.microsoft.com/office/drawing/2016/5/9/chartex" xmlns:cx4="http://schemas.microsoft.com/office/drawing/2016/5/10/chartex" xmlns:cx5="http://schemas.microsoft.com/office/drawing/2016/5/11/chartex" xmlns:cx6="http://schemas.microsoft.com/office/drawing/2016/5/12/chartex" xmlns:cx7="http://schemas.microsoft.com/office/drawing/2016/5/13/chartex" xmlns:cx8="http://schemas.microsoft.com/office/drawing/2016/5/14/chartex" xmlns:aink="http://schemas.microsoft.com/office/drawing/2016/ink" xmlns:am3d="http://schemas.microsoft.com/office/drawing/2017/model3d" xmlns:w16cex="http://schemas.microsoft.com/office/word/2018/wordml/cex" xmlns:w16cid="http://schemas.microsoft.com/office/word/2016/wordml/cid" xmlns:w16="http://schemas.microsoft.com/office/word/2018/wordml" xmlns:w16sdtdh="http://schemas.microsoft.com/office/word/2020/wordml/sdtdatahash" xmlns:w16se="http://schemas.microsoft.com/office/word/2015/wordml/symex" mc:Ignorable="w14 w15 wp14">
   <w:body>
     <w:p>
@@ -79,7 +103,7 @@
           <w:sz w:val="20"/>
           <w:szCs w:val="20"/>
         </w:rPr>
-        <w:t xml:space="preserve">Versión del manual: 20 de julio de 2026 (actualizado) — refleja el sistema hasta esta fecha</w:t>
+        <w:t xml:space="preserve">Versión del manual: 23 de julio de 2026 (actualizado) — refleja el sistema hasta esta fecha</w:t>
       </w:r>
     </w:p>
     <w:p>
@@ -447,7 +471,7 @@
         <w:spacing w:after="80"/>
       </w:pPr>
       <w:r>
-        <w:t xml:space="preserve">Tareas atrasadas de todos los eventos, para atenderlas primero.</w:t>
+        <w:t xml:space="preserve">Tareas atrasadas de todos los eventos, para atenderlas primero, con los días de atraso marcados en rojo junto a cada una.</w:t>
       </w:r>
     </w:p>
     <w:p>
@@ -859,7 +883,7 @@
         <w:spacing w:after="160"/>
       </w:pPr>
       <w:r>
-        <w:t xml:space="preserve">La pestaña Tareas de un evento lista todos sus pendientes, con filtros rápidos por estado (Todas / Pendiente / En progreso / Completada / Con problema).</w:t>
+        <w:t xml:space="preserve">La pestaña Tareas de un evento lista todos sus pendientes, con filtros rápidos por estado (Todas / Pendiente / En progreso / Completada / Con problema / Atrasadas) y muestra, en rojo, los días de atraso de cada tarea vencida.</w:t>
       </w:r>
     </w:p>
     <w:p>
@@ -876,7 +900,7 @@
         <w:spacing w:after="160"/>
       </w:pPr>
       <w:r>
-        <w:t xml:space="preserve">"Nueva tarea" abre el formulario con título, descripción, categoría, encargado (persona del equipo, proveedor, o el nombre de alguien externo), supervisor, fecha y hora límite, el momento del itinerario al que está vinculada (opcional) y qué evidencia exige antes de poder completarla: foto, video y/o documento.</w:t>
+        <w:t xml:space="preserve">"Nueva tarea" abre el formulario con título, descripción, categoría, encargado (persona del equipo, proveedor, o el nombre de alguien externo), supervisor, fecha y hora límite, el momento del itinerario al que está vinculada (opcional), la casilla “En el guión” (marca si la tarea forma parte del guión / minuto a minuto del evento — se puede filtrar luego en el reporte Minuto a minuto) y qué evidencia exige antes de poder completarla: foto, video y/o documento. Las tareas marcadas como guión muestran una etiqueta “Guión” en la lista de tareas y en el detalle de la tarea, entre los botones Editar y Cambiar estado.</w:t>
       </w:r>
     </w:p>
     <w:p>
@@ -1759,7 +1783,7 @@
         <w:spacing w:after="160"/>
       </w:pPr>
       <w:r>
-        <w:t xml:space="preserve">Muestra, en un diagrama automático, el orden de entrada y de salida del cortejo frente al altar, con las columnas izquierda / centro / derecha, más una tabla editable debajo con el detalle y la música de cada momento.</w:t>
+        <w:t xml:space="preserve">Muestra, en un diagrama automático, el orden de entrada y de salida del cortejo frente al altar, con las columnas izquierda / centro / derecha, más una tabla editable debajo con el detalle y la música de cada momento. En la Entrada el altar aparece arriba y la entrada de la iglesia abajo, con el orden aumentando hacia el altar. En la Salida el diagrama se invierte — Salida/Puerta arriba y Altar abajo — y el orden 0 (reservado para alguien que no camina con el cortejo, como el sacerdote) siempre queda pegado al altar sin importar su número.</w:t>
       </w:r>
     </w:p>
     <w:p>
@@ -1819,20 +1843,20 @@
         <w:spacing w:after="80"/>
       </w:pPr>
       <w:r>
-        <w:t xml:space="preserve">El altar y la entrada/salida quedan resaltados en el diagrama para ubicarse rápido.</w:t>
-      </w:r>
-    </w:p>
-    <w:p>
-      <w:pPr>
-        <w:pStyle w:val="ListParagraph"/>
-        <w:numPr>
-          <w:ilvl w:val="0"/>
-          <w:numId w:val="2"/>
-        </w:numPr>
-        <w:spacing w:after="80"/>
-      </w:pPr>
-      <w:r>
-        <w:t xml:space="preserve">Un pie de página, solo en la versión impresa, con la fecha y hora en que se imprimió.</w:t>
+        <w:t xml:space="preserve">El altar y la entrada/salida quedan resaltados en el diagrama para ubicarse rápido, junto con un ícono de flecha roja — a la izquierda o a la derecha, según se elija con los botones “Izquierda”/“Derecha” — que señala el sentido en que camina el cortejo.</w:t>
+      </w:r>
+    </w:p>
+    <w:p>
+      <w:pPr>
+        <w:pStyle w:val="ListParagraph"/>
+        <w:numPr>
+          <w:ilvl w:val="0"/>
+          <w:numId w:val="2"/>
+        </w:numPr>
+        <w:spacing w:after="80"/>
+      </w:pPr>
+      <w:r>
+        <w:t xml:space="preserve">Al imprimir, solo se envía el contenido del diagrama — el encabezado y pie de página con fecha, hora o dirección que pueda agregar el navegador no forman parte de EventPlanner.</w:t>
       </w:r>
     </w:p>
     <w:p>
@@ -1849,7 +1873,7 @@
           <w:iCs/>
           <w:color w:val="6c757d"/>
         </w:rPr>
-        <w:t xml:space="preserve">Nota: El encabezado con fecha/hora y nombre del sistema que agrega el propio navegador al imprimir (no el que se ve en la pantalla) se controla desde las opciones de impresión del navegador, no desde EventPlanner.</w:t>
+        <w:t xml:space="preserve">Nota: Ese encabezado/pie de página del navegador se puede quitar desde sus propias opciones de impresión (por ejemplo, en Chrome: “Más ajustes” → desmarcar “Encabezados y pies de página”).</w:t>
       </w:r>
     </w:p>
     <w:p>
@@ -2277,7 +2301,7 @@
                 <w:b w:val="false"/>
                 <w:bCs w:val="false"/>
               </w:rPr>
-              <w:t xml:space="preserve">Todas las secciones del itinerario (no solo Ceremonia y Recepción), cada actividad con las tareas vinculadas a ese momento. Filtros por sección, por fecha y hora, y de tareas (todas / solo pendientes); muestra la columna de fecha cuando el itinerario tiene más de un día.</w:t>
+              <w:t xml:space="preserve">Todas las secciones del itinerario (no solo Ceremonia y Recepción), cada actividad con las tareas vinculadas a ese momento. Filtros por sección, por fecha y hora, de tareas (todas / solo pendientes) y un filtro adicional “Guión” para ver solo las tareas marcadas como parte del guión; muestra la columna de fecha cuando el itinerario tiene más de un día.</w:t>
             </w:r>
           </w:p>
         </w:tc>
@@ -2782,11 +2806,7 @@
 </w:document>
 </file>
 
-<file path=word/comments.xml><?xml version="1.0" encoding="utf-8"?>
-<w:comments xmlns:cx="http://schemas.microsoft.com/office/drawing/2014/chartex" xmlns:cx1="http://schemas.microsoft.com/office/drawing/2015/9/8/chartex" xmlns:cx2="http://schemas.microsoft.com/office/drawing/2015/10/21/chartex" xmlns:cx3="http://schemas.microsoft.com/office/drawing/2016/5/9/chartex" xmlns:cx4="http://schemas.microsoft.com/office/drawing/2016/5/10/chartex" xmlns:cx5="http://schemas.microsoft.com/office/drawing/2016/5/11/chartex" xmlns:cx6="http://schemas.microsoft.com/office/drawing/2016/5/12/chartex" xmlns:cx7="http://schemas.microsoft.com/office/drawing/2016/5/13/chartex" xmlns:cx8="http://schemas.microsoft.com/office/drawing/2016/5/14/chartex" xmlns:mc="http://schemas.openxmlformats.org/markup-compatibility/2006" xmlns:aink="http://schemas.microsoft.com/office/drawing/2016/ink" xmlns:am3d="http://schemas.microsoft.com/office/drawing/2017/model3d" xmlns:o="urn:schemas-microsoft-com:office:office" xmlns:r="http://schemas.openxmlformats.org/officeDocument/2006/relationships" xmlns:m="http://schemas.openxmlformats.org/officeDocument/2006/math" xmlns:v="urn:schemas-microsoft-com:vml" xmlns:wp14="http://schemas.microsoft.com/office/word/2010/wordprocessingDrawing" xmlns:wp="http://schemas.openxmlformats.org/drawingml/2006/wordprocessingDrawing" xmlns:w10="urn:schemas-microsoft-com:office:word" xmlns:w="http://schemas.openxmlformats.org/wordprocessingml/2006/main" xmlns:w14="http://schemas.microsoft.com/office/word/2010/wordml" xmlns:w15="http://schemas.microsoft.com/office/word/2012/wordml" xmlns:w16cex="http://schemas.microsoft.com/office/word/2018/wordml/cex" xmlns:w16cid="http://schemas.microsoft.com/office/word/2016/wordml/cid" xmlns:w16="http://schemas.microsoft.com/office/word/2018/wordml" xmlns:w16sdtdh="http://schemas.microsoft.com/office/word/2020/wordml/sdtdatahash" xmlns:w16se="http://schemas.microsoft.com/office/word/2015/wordml/symex" xmlns:wpg="http://schemas.microsoft.com/office/word/2010/wordprocessingGroup" xmlns:wpi="http://schemas.microsoft.com/office/word/2010/wordprocessingInk" xmlns:wne="http://schemas.microsoft.com/office/word/2006/wordml" xmlns:wps="http://schemas.microsoft.com/office/word/2010/wordprocessingShape"/>
-</file>
-
-<file path=word/endnotes.xml><?xml version="1.0" encoding="utf-8"?>
+<file path=word\endnotes.xml><?xml version="1.0" encoding="utf-8"?>
 <w:endnotes xmlns:wpc="http://schemas.microsoft.com/office/word/2010/wordprocessingCanvas" xmlns:mc="http://schemas.openxmlformats.org/markup-compatibility/2006" xmlns:o="urn:schemas-microsoft-com:office:office" xmlns:r="http://schemas.openxmlformats.org/officeDocument/2006/relationships" xmlns:m="http://schemas.openxmlformats.org/officeDocument/2006/math" xmlns:v="urn:schemas-microsoft-com:vml" xmlns:wp14="http://schemas.microsoft.com/office/word/2010/wordprocessingDrawing" xmlns:wp="http://schemas.openxmlformats.org/drawingml/2006/wordprocessingDrawing" xmlns:w10="urn:schemas-microsoft-com:office:word" xmlns:w="http://schemas.openxmlformats.org/wordprocessingml/2006/main" xmlns:w14="http://schemas.microsoft.com/office/word/2010/wordml" xmlns:w15="http://schemas.microsoft.com/office/word/2012/wordml" xmlns:wpg="http://schemas.microsoft.com/office/word/2010/wordprocessingGroup" xmlns:wpi="http://schemas.microsoft.com/office/word/2010/wordprocessingInk" xmlns:wne="http://schemas.microsoft.com/office/word/2006/wordml" xmlns:wps="http://schemas.microsoft.com/office/word/2010/wordprocessingShape" mc:Ignorable="w14 w15 wp14">
   <w:endnote w:type="separator" w:id="-1">
     <w:p>
@@ -2823,7 +2843,11 @@
 </w:endnotes>
 </file>
 
-<file path=word/footer1.xml><?xml version="1.0" encoding="utf-8"?>
+<file path=word\fontTable.xml><?xml version="1.0" encoding="utf-8"?>
+<w:fonts xmlns:mc="http://schemas.openxmlformats.org/markup-compatibility/2006" xmlns:r="http://schemas.openxmlformats.org/officeDocument/2006/relationships" xmlns:w="http://schemas.openxmlformats.org/wordprocessingml/2006/main" xmlns:w14="http://schemas.microsoft.com/office/word/2010/wordml" xmlns:w15="http://schemas.microsoft.com/office/word/2012/wordml" xmlns:w16cex="http://schemas.microsoft.com/office/word/2018/wordml/cex" xmlns:w16cid="http://schemas.microsoft.com/office/word/2016/wordml/cid" xmlns:w16="http://schemas.microsoft.com/office/word/2018/wordml" xmlns:w16sdtdh="http://schemas.microsoft.com/office/word/2020/wordml/sdtdatahash" xmlns:w16se="http://schemas.microsoft.com/office/word/2015/wordml/symex" mc:Ignorable="w14 w15 w16se w16cid w16 w16cex w16sdtdh"/>
+</file>
+
+<file path=word\footer1.xml><?xml version="1.0" encoding="utf-8"?>
 <w:ftr xmlns:wpc="http://schemas.microsoft.com/office/word/2010/wordprocessingCanvas" xmlns:mc="http://schemas.openxmlformats.org/markup-compatibility/2006" xmlns:o="urn:schemas-microsoft-com:office:office" xmlns:r="http://schemas.openxmlformats.org/officeDocument/2006/relationships" xmlns:m="http://schemas.openxmlformats.org/officeDocument/2006/math" xmlns:v="urn:schemas-microsoft-com:vml" xmlns:wp14="http://schemas.microsoft.com/office/word/2010/wordprocessingDrawing" xmlns:wp="http://schemas.openxmlformats.org/drawingml/2006/wordprocessingDrawing" xmlns:w10="urn:schemas-microsoft-com:office:word" xmlns:w="http://schemas.openxmlformats.org/wordprocessingml/2006/main" xmlns:w14="http://schemas.microsoft.com/office/word/2010/wordml" xmlns:w15="http://schemas.microsoft.com/office/word/2012/wordml" xmlns:wpg="http://schemas.microsoft.com/office/word/2010/wordprocessingGroup" xmlns:wpi="http://schemas.microsoft.com/office/word/2010/wordprocessingInk" xmlns:wne="http://schemas.microsoft.com/office/word/2006/wordml" xmlns:wps="http://schemas.microsoft.com/office/word/2010/wordprocessingShape">
   <w:p>
     <w:pPr>
@@ -2871,7 +2895,7 @@
 </w:ftr>
 </file>
 
-<file path=word/footnotes.xml><?xml version="1.0" encoding="utf-8"?>
+<file path=word\footnotes.xml><?xml version="1.0" encoding="utf-8"?>
 <w:footnotes xmlns:wpc="http://schemas.microsoft.com/office/word/2010/wordprocessingCanvas" xmlns:mc="http://schemas.openxmlformats.org/markup-compatibility/2006" xmlns:o="urn:schemas-microsoft-com:office:office" xmlns:r="http://schemas.openxmlformats.org/officeDocument/2006/relationships" xmlns:m="http://schemas.openxmlformats.org/officeDocument/2006/math" xmlns:v="urn:schemas-microsoft-com:vml" xmlns:wp14="http://schemas.microsoft.com/office/word/2010/wordprocessingDrawing" xmlns:wp="http://schemas.openxmlformats.org/drawingml/2006/wordprocessingDrawing" xmlns:w10="urn:schemas-microsoft-com:office:word" xmlns:w="http://schemas.openxmlformats.org/wordprocessingml/2006/main" xmlns:w14="http://schemas.microsoft.com/office/word/2010/wordml" xmlns:w15="http://schemas.microsoft.com/office/word/2012/wordml" xmlns:wpg="http://schemas.microsoft.com/office/word/2010/wordprocessingGroup" xmlns:wpi="http://schemas.microsoft.com/office/word/2010/wordprocessingInk" xmlns:wne="http://schemas.microsoft.com/office/word/2006/wordml" xmlns:wps="http://schemas.microsoft.com/office/word/2010/wordprocessingShape" mc:Ignorable="w14 w15 wp14">
   <w:footnote w:type="separator" w:id="-1">
     <w:p>
@@ -2908,7 +2932,7 @@
 </w:footnotes>
 </file>
 
-<file path=word/header1.xml><?xml version="1.0" encoding="utf-8"?>
+<file path=word\header1.xml><?xml version="1.0" encoding="utf-8"?>
 <w:hdr xmlns:wpc="http://schemas.microsoft.com/office/word/2010/wordprocessingCanvas" xmlns:mc="http://schemas.openxmlformats.org/markup-compatibility/2006" xmlns:o="urn:schemas-microsoft-com:office:office" xmlns:r="http://schemas.openxmlformats.org/officeDocument/2006/relationships" xmlns:m="http://schemas.openxmlformats.org/officeDocument/2006/math" xmlns:v="urn:schemas-microsoft-com:vml" xmlns:wp14="http://schemas.microsoft.com/office/word/2010/wordprocessingDrawing" xmlns:wp="http://schemas.openxmlformats.org/drawingml/2006/wordprocessingDrawing" xmlns:w10="urn:schemas-microsoft-com:office:word" xmlns:w="http://schemas.openxmlformats.org/wordprocessingml/2006/main" xmlns:w14="http://schemas.microsoft.com/office/word/2010/wordml" xmlns:w15="http://schemas.microsoft.com/office/word/2012/wordml" xmlns:wpg="http://schemas.microsoft.com/office/word/2010/wordprocessingGroup" xmlns:wpi="http://schemas.microsoft.com/office/word/2010/wordprocessingInk" xmlns:wne="http://schemas.microsoft.com/office/word/2006/wordml" xmlns:wps="http://schemas.microsoft.com/office/word/2010/wordprocessingShape" xmlns:cx="http://schemas.microsoft.com/office/drawing/2014/chartex" xmlns:cx1="http://schemas.microsoft.com/office/drawing/2015/9/8/chartex" xmlns:cx2="http://schemas.microsoft.com/office/drawing/2015/10/21/chartex" xmlns:cx3="http://schemas.microsoft.com/office/drawing/2016/5/9/chartex" xmlns:cx4="http://schemas.microsoft.com/office/drawing/2016/5/10/chartex" xmlns:cx5="http://schemas.microsoft.com/office/drawing/2016/5/11/chartex" xmlns:cx6="http://schemas.microsoft.com/office/drawing/2016/5/12/chartex" xmlns:cx7="http://schemas.microsoft.com/office/drawing/2016/5/13/chartex" xmlns:cx8="http://schemas.microsoft.com/office/drawing/2016/5/14/chartex" xmlns:w16cid="http://schemas.microsoft.com/office/word/2016/wordml/cid" xmlns:w16se="http://schemas.microsoft.com/office/word/2015/wordml/symex">
   <w:p>
     <w:pPr>
@@ -2926,7 +2950,7 @@
 </w:hdr>
 </file>
 
-<file path=word/numbering.xml><?xml version="1.0" encoding="utf-8"?>
+<file path=word\numbering.xml><?xml version="1.0" encoding="utf-8"?>
 <w:numbering xmlns:wpc="http://schemas.microsoft.com/office/word/2010/wordprocessingCanvas" xmlns:mc="http://schemas.openxmlformats.org/markup-compatibility/2006" xmlns:o="urn:schemas-microsoft-com:office:office" xmlns:r="http://schemas.openxmlformats.org/officeDocument/2006/relationships" xmlns:m="http://schemas.openxmlformats.org/officeDocument/2006/math" xmlns:v="urn:schemas-microsoft-com:vml" xmlns:wp14="http://schemas.microsoft.com/office/word/2010/wordprocessingDrawing" xmlns:wp="http://schemas.openxmlformats.org/drawingml/2006/wordprocessingDrawing" xmlns:w10="urn:schemas-microsoft-com:office:word" xmlns:w="http://schemas.openxmlformats.org/wordprocessingml/2006/main" xmlns:w14="http://schemas.microsoft.com/office/word/2010/wordml" xmlns:w15="http://schemas.microsoft.com/office/word/2012/wordml" xmlns:wpg="http://schemas.microsoft.com/office/word/2010/wordprocessingGroup" xmlns:wpi="http://schemas.microsoft.com/office/word/2010/wordprocessingInk" xmlns:wne="http://schemas.microsoft.com/office/word/2006/wordml" xmlns:wps="http://schemas.microsoft.com/office/word/2010/wordprocessingShape" mc:Ignorable="w14 w15 wp14">
   <w:abstractNum w:abstractNumId="1" w15:restartNumberingAfterBreak="0">
     <w:multiLevelType w:val="hybridMultilevel"/>
@@ -3051,7 +3075,17 @@
 </w:numbering>
 </file>
 
-<file path=word/styles.xml><?xml version="1.0" encoding="utf-8"?>
+<file path=word\settings.xml><?xml version="1.0" encoding="utf-8"?>
+<w:settings xmlns:wpc="http://schemas.microsoft.com/office/word/2010/wordprocessingCanvas" xmlns:mc="http://schemas.openxmlformats.org/markup-compatibility/2006" xmlns:o="urn:schemas-microsoft-com:office:office" xmlns:r="http://schemas.openxmlformats.org/officeDocument/2006/relationships" xmlns:m="http://schemas.openxmlformats.org/officeDocument/2006/math" xmlns:v="urn:schemas-microsoft-com:vml" xmlns:wp14="http://schemas.microsoft.com/office/word/2010/wordprocessingDrawing" xmlns:wp="http://schemas.openxmlformats.org/drawingml/2006/wordprocessingDrawing" xmlns:w10="urn:schemas-microsoft-com:office:word" xmlns:w="http://schemas.openxmlformats.org/wordprocessingml/2006/main" xmlns:w14="http://schemas.microsoft.com/office/word/2010/wordml" xmlns:w15="http://schemas.microsoft.com/office/word/2012/wordml" xmlns:wpg="http://schemas.microsoft.com/office/word/2010/wordprocessingGroup" xmlns:wpi="http://schemas.microsoft.com/office/word/2010/wordprocessingInk" xmlns:wne="http://schemas.microsoft.com/office/word/2006/wordml" xmlns:wps="http://schemas.microsoft.com/office/word/2010/wordprocessingShape" mc:Ignorable="w14 w15 wp14">
+  <w:displayBackgroundShape/>
+  <w:evenAndOddHeaders w:val="false"/>
+  <w:compat>
+    <w:compatSetting w:val="15" w:name="compatibilityMode" w:uri="http://schemas.microsoft.com/office/word"/>
+  </w:compat>
+</w:settings>
+</file>
+
+<file path=word\styles.xml><?xml version="1.0" encoding="utf-8"?>
 <w:styles xmlns:mc="http://schemas.openxmlformats.org/markup-compatibility/2006" xmlns:r="http://schemas.openxmlformats.org/officeDocument/2006/relationships" xmlns:w="http://schemas.openxmlformats.org/wordprocessingml/2006/main" xmlns:w14="http://schemas.microsoft.com/office/word/2010/wordml" xmlns:w15="http://schemas.microsoft.com/office/word/2012/wordml" mc:Ignorable="w14 w15">
   <w:docDefaults>
     <w:rPrDefault>

</xml_diff>

<commit_message>
Update user manual through 4 de agosto de 2026
Adds everything built since the last manual revision (23 de julio):

- 7.9 Eliminar una tarea, 7.10 Cadenas de tareas, 7.11 Exportar el guión
  a tu calendario (teléfono / reloj)
- Buscador en la lista de tareas; campo "Iniciales" del equipo
- Facturación: editar líneas y bloqueo al anular/marcar como pagada
- 11.1 Cortejo nupcial: unir listas, buscar en plan de mesas, eliminar
  una lista por evento
- 11.4 Plan de mesas: importar invitados desde Excel, captura rápida
- 11.5 Reportes: filtro de fecha que también considera la fecha de la
  tarea + selección de varias secciones (minuto a minuto), selección de
  varias listas (cortejo)
- 3 preguntas frecuentes nuevas; fecha de versión actualizada

Co-Authored-By: Claude Sonnet 5 <noreply@anthropic.com>
</commit_message>
<xml_diff>
--- a/docs/Manual_Usuario_EventPlanner.docx
+++ b/docs/Manual_Usuario_EventPlanner.docx
@@ -1,29 +1,5 @@
 
-<file path=docProps\app.xml><?xml version="1.0" encoding="utf-8"?>
-<Properties xmlns="http://schemas.openxmlformats.org/officeDocument/2006/extended-properties" xmlns:vt="http://schemas.openxmlformats.org/officeDocument/2006/docPropsVTypes"/>
-</file>
-
-<file path=docProps\core.xml><?xml version="1.0" encoding="utf-8"?>
-<cp:coreProperties xmlns:cp="http://schemas.openxmlformats.org/package/2006/metadata/core-properties" xmlns:dc="http://purl.org/dc/elements/1.1/" xmlns:dcterms="http://purl.org/dc/terms/" xmlns:dcmitype="http://purl.org/dc/dcmitype/" xmlns:xsi="http://www.w3.org/2001/XMLSchema-instance">
-  <dc:title>Manual de Usuario — EventPlanner</dc:title>
-  <dc:creator>EventPlanner</dc:creator>
-  <dc:description>Manual de usuario del sistema EventPlanner para Bodas Aurora Eventos</dc:description>
-  <cp:lastModifiedBy>Un-named</cp:lastModifiedBy>
-  <cp:revision>1</cp:revision>
-  <dcterms:created xsi:type="dcterms:W3CDTF">2026-07-21T03:38:39.162Z</dcterms:created>
-  <dcterms:modified xsi:type="dcterms:W3CDTF">2026-07-21T03:38:39.163Z</dcterms:modified>
-</cp:coreProperties>
-</file>
-
-<file path=docProps\custom.xml><?xml version="1.0" encoding="utf-8"?>
-<Properties xmlns="http://schemas.openxmlformats.org/officeDocument/2006/custom-properties" xmlns:vt="http://schemas.openxmlformats.org/officeDocument/2006/docPropsVTypes"/>
-</file>
-
-<file path=word\comments.xml><?xml version="1.0" encoding="utf-8"?>
-<w:comments xmlns:cx="http://schemas.microsoft.com/office/drawing/2014/chartex" xmlns:cx1="http://schemas.microsoft.com/office/drawing/2015/9/8/chartex" xmlns:cx2="http://schemas.microsoft.com/office/drawing/2015/10/21/chartex" xmlns:cx3="http://schemas.microsoft.com/office/drawing/2016/5/9/chartex" xmlns:cx4="http://schemas.microsoft.com/office/drawing/2016/5/10/chartex" xmlns:cx5="http://schemas.microsoft.com/office/drawing/2016/5/11/chartex" xmlns:cx6="http://schemas.microsoft.com/office/drawing/2016/5/12/chartex" xmlns:cx7="http://schemas.microsoft.com/office/drawing/2016/5/13/chartex" xmlns:cx8="http://schemas.microsoft.com/office/drawing/2016/5/14/chartex" xmlns:mc="http://schemas.openxmlformats.org/markup-compatibility/2006" xmlns:aink="http://schemas.microsoft.com/office/drawing/2016/ink" xmlns:am3d="http://schemas.microsoft.com/office/drawing/2017/model3d" xmlns:o="urn:schemas-microsoft-com:office:office" xmlns:r="http://schemas.openxmlformats.org/officeDocument/2006/relationships" xmlns:m="http://schemas.openxmlformats.org/officeDocument/2006/math" xmlns:v="urn:schemas-microsoft-com:vml" xmlns:wp14="http://schemas.microsoft.com/office/word/2010/wordprocessingDrawing" xmlns:wp="http://schemas.openxmlformats.org/drawingml/2006/wordprocessingDrawing" xmlns:w10="urn:schemas-microsoft-com:office:word" xmlns:w="http://schemas.openxmlformats.org/wordprocessingml/2006/main" xmlns:w14="http://schemas.microsoft.com/office/word/2010/wordml" xmlns:w15="http://schemas.microsoft.com/office/word/2012/wordml" xmlns:w16cex="http://schemas.microsoft.com/office/word/2018/wordml/cex" xmlns:w16cid="http://schemas.microsoft.com/office/word/2016/wordml/cid" xmlns:w16="http://schemas.microsoft.com/office/word/2018/wordml" xmlns:w16sdtdh="http://schemas.microsoft.com/office/word/2020/wordml/sdtdatahash" xmlns:w16se="http://schemas.microsoft.com/office/word/2015/wordml/symex" xmlns:wpg="http://schemas.microsoft.com/office/word/2010/wordprocessingGroup" xmlns:wpi="http://schemas.microsoft.com/office/word/2010/wordprocessingInk" xmlns:wne="http://schemas.microsoft.com/office/word/2006/wordml" xmlns:wps="http://schemas.microsoft.com/office/word/2010/wordprocessingShape"/>
-</file>
-
-<file path=word\document.xml><?xml version="1.0" encoding="utf-8"?>
+<file path=word/document.xml><?xml version="1.0" encoding="utf-8"?>
 <w:document xmlns:wpc="http://schemas.microsoft.com/office/word/2010/wordprocessingCanvas" xmlns:mc="http://schemas.openxmlformats.org/markup-compatibility/2006" xmlns:o="urn:schemas-microsoft-com:office:office" xmlns:r="http://schemas.openxmlformats.org/officeDocument/2006/relationships" xmlns:m="http://schemas.openxmlformats.org/officeDocument/2006/math" xmlns:v="urn:schemas-microsoft-com:vml" xmlns:wp14="http://schemas.microsoft.com/office/word/2010/wordprocessingDrawing" xmlns:wp="http://schemas.openxmlformats.org/drawingml/2006/wordprocessingDrawing" xmlns:w10="urn:schemas-microsoft-com:office:word" xmlns:w="http://schemas.openxmlformats.org/wordprocessingml/2006/main" xmlns:w14="http://schemas.microsoft.com/office/word/2010/wordml" xmlns:w15="http://schemas.microsoft.com/office/word/2012/wordml" xmlns:wpg="http://schemas.microsoft.com/office/word/2010/wordprocessingGroup" xmlns:wpi="http://schemas.microsoft.com/office/word/2010/wordprocessingInk" xmlns:wne="http://schemas.microsoft.com/office/word/2006/wordml" xmlns:wps="http://schemas.microsoft.com/office/word/2010/wordprocessingShape" xmlns:cx="http://schemas.microsoft.com/office/drawing/2014/chartex" xmlns:cx1="http://schemas.microsoft.com/office/drawing/2015/9/8/chartex" xmlns:cx2="http://schemas.microsoft.com/office/drawing/2015/10/21/chartex" xmlns:cx3="http://schemas.microsoft.com/office/drawing/2016/5/9/chartex" xmlns:cx4="http://schemas.microsoft.com/office/drawing/2016/5/10/chartex" xmlns:cx5="http://schemas.microsoft.com/office/drawing/2016/5/11/chartex" xmlns:cx6="http://schemas.microsoft.com/office/drawing/2016/5/12/chartex" xmlns:cx7="http://schemas.microsoft.com/office/drawing/2016/5/13/chartex" xmlns:cx8="http://schemas.microsoft.com/office/drawing/2016/5/14/chartex" xmlns:aink="http://schemas.microsoft.com/office/drawing/2016/ink" xmlns:am3d="http://schemas.microsoft.com/office/drawing/2017/model3d" xmlns:w16cex="http://schemas.microsoft.com/office/word/2018/wordml/cex" xmlns:w16cid="http://schemas.microsoft.com/office/word/2016/wordml/cid" xmlns:w16="http://schemas.microsoft.com/office/word/2018/wordml" xmlns:w16sdtdh="http://schemas.microsoft.com/office/word/2020/wordml/sdtdatahash" xmlns:w16se="http://schemas.microsoft.com/office/word/2015/wordml/symex" mc:Ignorable="w14 w15 wp14">
   <w:body>
     <w:p>
@@ -103,7 +79,7 @@
           <w:sz w:val="20"/>
           <w:szCs w:val="20"/>
         </w:rPr>
-        <w:t xml:space="preserve">Versión del manual: 23 de julio de 2026 (actualizado) — refleja el sistema hasta esta fecha</w:t>
+        <w:t>Versión del manual: 4 de agosto de 2026 (actualizado) — refleja el sistema hasta esta fecha</w:t>
       </w:r>
     </w:p>
     <w:p>
@@ -406,6 +382,14 @@
       </w:r>
     </w:p>
     <w:p>
+      <w:r>
+        <w:rPr>
+          <w:i/>
+        </w:rPr>
+        <w:t>Nota: La hora se muestra siempre en formato 24 horas (por ejemplo 14:30) en todo el sistema, sin importar el idioma.</w:t>
+      </w:r>
+    </w:p>
+    <w:p>
       <w:pPr>
         <w:pStyle w:val="Heading1"/>
         <w:spacing w:after="200" w:before="400"/>
@@ -853,6 +837,11 @@
       </w:r>
     </w:p>
     <w:p>
+      <w:r>
+        <w:t>Cada persona del equipo tiene un campo opcional "Iniciales" (por ejemplo JCJ). Si se deja vacío, el sistema calcula unas iniciales automáticamente a partir del nombre y apellido. Estas iniciales se usan para mostrar al responsable de forma compacta en el reporte Minuto a minuto, en vez del nombre completo.</w:t>
+      </w:r>
+    </w:p>
+    <w:p>
       <w:pPr>
         <w:pStyle w:val="Heading2"/>
         <w:spacing w:after="120" w:before="300"/>
@@ -887,6 +876,11 @@
       </w:r>
     </w:p>
     <w:p>
+      <w:r>
+        <w:t>Un buscador por título o responsable, arriba de la lista, permite filtrar rápidamente sin usar los botones de estado.</w:t>
+      </w:r>
+    </w:p>
+    <w:p>
       <w:pPr>
         <w:pStyle w:val="Heading2"/>
         <w:spacing w:after="120" w:before="300"/>
@@ -901,6 +895,11 @@
       </w:pPr>
       <w:r>
         <w:t xml:space="preserve">"Nueva tarea" abre el formulario con título, descripción, categoría, encargado (persona del equipo, proveedor, o el nombre de alguien externo), supervisor, fecha y hora límite, el momento del itinerario al que está vinculada (opcional), la casilla “En el guión” (marca si la tarea forma parte del guión / minuto a minuto del evento — se puede filtrar luego en el reporte Minuto a minuto) y qué evidencia exige antes de poder completarla: foto, video y/o documento. Las tareas marcadas como guión muestran una etiqueta “Guión” en la lista de tareas y en el detalle de la tarea, entre los botones Editar y Cambiar estado.</w:t>
+      </w:r>
+    </w:p>
+    <w:p>
+      <w:r>
+        <w:t>Desde este mismo formulario también se puede elegir la cadena de tareas (ver 7.10) a la que pertenece la tarea, sin necesidad de entrar primero a la cadena — incluso para cambiarla de una cadena a otra o quitarle la cadena que tenía.</w:t>
       </w:r>
     </w:p>
     <w:p>
@@ -1239,6 +1238,173 @@
     </w:p>
     <w:p>
       <w:pPr>
+        <w:pStyle w:val="Heading2"/>
+      </w:pPr>
+      <w:r>
+        <w:t>7.9 Eliminar una tarea</w:t>
+      </w:r>
+    </w:p>
+    <w:p>
+      <w:r>
+        <w:t>El botón "Eliminar" en el detalle de la tarea (junto a "Editar") la borra por completo, incluyendo cualquier evidencia subida — se pide confirmación antes de hacerlo. Solo puede eliminarla quien tiene permiso para editar tareas (planificador, administrador o supervisor).</w:t>
+      </w:r>
+    </w:p>
+    <w:p>
+      <w:pPr>
+        <w:pStyle w:val="Heading2"/>
+      </w:pPr>
+      <w:r>
+        <w:t>7.10 Cadenas de tareas</w:t>
+      </w:r>
+    </w:p>
+    <w:p>
+      <w:r>
+        <w:t>Una cadena de tareas agrupa varias tareas relacionadas en una secuencia ordenada — por ejemplo "Comprar reloj → Grabar reloj → Ir por el reloj → Llevar el reloj a la ceremonia" — únicamente para organizarlas y ubicarlas de un vistazo. No bloquea ni automatiza nada: cada tarea sigue siendo independiente, con su propio responsable, fecha, evidencia y estado.</w:t>
+      </w:r>
+    </w:p>
+    <w:p>
+      <w:pPr>
+        <w:pStyle w:val="ListParagraph"/>
+        <w:numPr>
+          <w:ilvl w:val="0"/>
+          <w:numId w:val="2"/>
+        </w:numPr>
+      </w:pPr>
+      <w:r>
+        <w:t>"Nueva cadena de tareas" (junto a "Nueva tarea", en la lista de tareas del evento) crea la cadena con un nombre y una descripción opcional.</w:t>
+      </w:r>
+    </w:p>
+    <w:p>
+      <w:pPr>
+        <w:pStyle w:val="ListParagraph"/>
+        <w:numPr>
+          <w:ilvl w:val="0"/>
+          <w:numId w:val="2"/>
+        </w:numPr>
+      </w:pPr>
+      <w:r>
+        <w:t>Dentro de una cadena se pueden agregar tareas nuevas (con el mismo formulario completo de siempre) o tareas ya existentes del evento que todavía no pertenezcan a otra cadena.</w:t>
+      </w:r>
+    </w:p>
+    <w:p>
+      <w:pPr>
+        <w:pStyle w:val="ListParagraph"/>
+        <w:numPr>
+          <w:ilvl w:val="0"/>
+          <w:numId w:val="2"/>
+        </w:numPr>
+      </w:pPr>
+      <w:r>
+        <w:t>Los botones de flecha arriba/abajo reordenan los pasos de la cadena.</w:t>
+      </w:r>
+    </w:p>
+    <w:p>
+      <w:pPr>
+        <w:pStyle w:val="ListParagraph"/>
+        <w:numPr>
+          <w:ilvl w:val="0"/>
+          <w:numId w:val="2"/>
+        </w:numPr>
+      </w:pPr>
+      <w:r>
+        <w:t>"Quitar" saca una tarea de la cadena sin eliminarla.</w:t>
+      </w:r>
+    </w:p>
+    <w:p>
+      <w:pPr>
+        <w:pStyle w:val="ListParagraph"/>
+        <w:numPr>
+          <w:ilvl w:val="0"/>
+          <w:numId w:val="2"/>
+        </w:numPr>
+      </w:pPr>
+      <w:r>
+        <w:t>Cada tarea de una cadena tiene su propio botón "Editar" dentro de la vista de la cadena, para no tener que salir a la pantalla de la tarea.</w:t>
+      </w:r>
+    </w:p>
+    <w:p>
+      <w:pPr>
+        <w:pStyle w:val="ListParagraph"/>
+        <w:numPr>
+          <w:ilvl w:val="0"/>
+          <w:numId w:val="2"/>
+        </w:numPr>
+      </w:pPr>
+      <w:r>
+        <w:t>"Eliminar" (sobre la cadena) borra la cadena pero no las tareas que contenía: quedan sueltas, sin cadena.</w:t>
+      </w:r>
+    </w:p>
+    <w:p>
+      <w:pPr>
+        <w:pStyle w:val="ListParagraph"/>
+        <w:numPr>
+          <w:ilvl w:val="0"/>
+          <w:numId w:val="2"/>
+        </w:numPr>
+      </w:pPr>
+      <w:r>
+        <w:t>En el detalle de la tarea y en "Mis tareas" aparece, de forma opcional, "Cadena: [nombre] — Paso N de M" cuando la tarea pertenece a una.</w:t>
+      </w:r>
+    </w:p>
+    <w:p>
+      <w:pPr>
+        <w:pStyle w:val="ListParagraph"/>
+        <w:numPr>
+          <w:ilvl w:val="0"/>
+          <w:numId w:val="2"/>
+        </w:numPr>
+      </w:pPr>
+      <w:r>
+        <w:t>El interruptor "Lista de tareas" / "Cadenas de tareas", arriba de la pantalla de tareas, cambia entre ver todas las tareas sueltas o solo las cadenas.</w:t>
+      </w:r>
+    </w:p>
+    <w:p>
+      <w:pPr>
+        <w:pStyle w:val="Heading2"/>
+      </w:pPr>
+      <w:r>
+        <w:t>7.11 Exportar el guión a tu calendario (teléfono / reloj)</w:t>
+      </w:r>
+    </w:p>
+    <w:p>
+      <w:r>
+        <w:t>Las tareas marcadas como "En el guión" (ver 7.1) se pueden exportar al calendario del celular para recibir alarmas, desde el botón "Guión a calendario" en la lista de tareas del evento. Hay dos formas:</w:t>
+      </w:r>
+    </w:p>
+    <w:p>
+      <w:pPr>
+        <w:pStyle w:val="ListParagraph"/>
+        <w:numPr>
+          <w:ilvl w:val="0"/>
+          <w:numId w:val="2"/>
+        </w:numPr>
+      </w:pPr>
+      <w:r>
+        <w:t>"Suscribirse desde el celular" crea un calendario nuevo y separado (con el nombre del evento) que se actualiza solo si cambian las tareas del guión. Importante: iPhone y Android no permiten alarmas en calendarios suscritos — esta opción sirve para tener siempre el guión al día, pero sin sonido de alarma.</w:t>
+      </w:r>
+    </w:p>
+    <w:p>
+      <w:pPr>
+        <w:pStyle w:val="ListParagraph"/>
+        <w:numPr>
+          <w:ilvl w:val="0"/>
+          <w:numId w:val="2"/>
+        </w:numPr>
+      </w:pPr>
+      <w:r>
+        <w:t>"Descargar archivo .ics" es una copia fija del guión en ese momento, que sí incluye una alarma 15 minutos antes de cada tarea al importarla directamente al calendario del teléfono. No se actualiza sola: si cambian las tareas hay que volver a descargarla.</w:t>
+      </w:r>
+    </w:p>
+    <w:p>
+      <w:r>
+        <w:rPr>
+          <w:i/>
+        </w:rPr>
+        <w:t>Nota: Si el link de suscripción no hace nada al tocarlo (pasa en algunos navegadores, como el de WhatsApp), se puede copiar la dirección que aparece debajo y pegarla manualmente en Ajustes → Calendario → Añadir calendario suscrito.</w:t>
+      </w:r>
+    </w:p>
+    <w:p>
+      <w:pPr>
         <w:pStyle w:val="Heading1"/>
         <w:spacing w:after="200" w:before="400"/>
       </w:pPr>
@@ -1670,6 +1836,19 @@
     <w:p>
       <w:pPr>
         <w:pStyle w:val="Heading3"/>
+      </w:pPr>
+      <w:r>
+        <w:t>Editar líneas y bloqueo</w:t>
+      </w:r>
+    </w:p>
+    <w:p>
+      <w:r>
+        <w:t>Cualquier línea ya agregada a la factura se puede corregir con el ícono de lápiz, igual que en las cotizaciones. Una vez que la factura está anulada o marcada como pagada, tanto sus datos generales como sus líneas quedan bloqueados para edición, para no alterar un documento que el cliente ya recibió como definitivo.</w:t>
+      </w:r>
+    </w:p>
+    <w:p>
+      <w:pPr>
+        <w:pStyle w:val="Heading3"/>
         <w:spacing w:after="80" w:before="200"/>
       </w:pPr>
       <w:r>
@@ -1767,6 +1946,42 @@
       </w:pPr>
       <w:r>
         <w:t xml:space="preserve">Administra las listas del cortejo (por ejemplo boutonnieres, damas y caballeros, orden de discursos), cada una con nombre, rol o descripción, cantidad, orden y mesa. Las listas disponibles se administran desde su propio mantenimiento, igual que las secciones o categorías.</w:t>
+      </w:r>
+    </w:p>
+    <w:p>
+      <w:pPr>
+        <w:pStyle w:val="ListParagraph"/>
+        <w:numPr>
+          <w:ilvl w:val="0"/>
+          <w:numId w:val="2"/>
+        </w:numPr>
+      </w:pPr>
+      <w:r>
+        <w:t>"Buscar en plan de mesas" busca a alguien que ya está capturado en el plan de mesas y lo agrega directamente a una o varias listas del cortejo, sin volver a escribir su nombre.</w:t>
+      </w:r>
+    </w:p>
+    <w:p>
+      <w:pPr>
+        <w:pStyle w:val="ListParagraph"/>
+        <w:numPr>
+          <w:ilvl w:val="0"/>
+          <w:numId w:val="2"/>
+        </w:numPr>
+      </w:pPr>
+      <w:r>
+        <w:t>"Unir listas" combina 2 o más listas en una nueva, moviendo a las personas de ese evento (no las duplica) — las listas de origen quedan vacías para ese evento, pero la categoría sigue disponible para otros eventos.</w:t>
+      </w:r>
+    </w:p>
+    <w:p>
+      <w:pPr>
+        <w:pStyle w:val="ListParagraph"/>
+        <w:numPr>
+          <w:ilvl w:val="0"/>
+          <w:numId w:val="2"/>
+        </w:numPr>
+      </w:pPr>
+      <w:r>
+        <w:t>Cada lista tiene su propio botón para eliminarla de ese evento: borra solo a las personas que ese evento tiene en esa lista; la categoría de lista sigue existiendo y disponible para otros eventos.</w:t>
       </w:r>
     </w:p>
     <w:p>
@@ -1942,6 +2157,32 @@
       </w:pPr>
       <w:r>
         <w:t xml:space="preserve">Para cambiar a alguien de mesa no hace falta borrarlo y volver a capturarlo: junto a su nombre hay un menú desplegable con todas las mesas del evento — al elegir una distinta, el invitado se mueve automáticamente.</w:t>
+      </w:r>
+    </w:p>
+    <w:p>
+      <w:pPr>
+        <w:pStyle w:val="Heading3"/>
+      </w:pPr>
+      <w:r>
+        <w:t>Importar invitados desde Excel</w:t>
+      </w:r>
+    </w:p>
+    <w:p>
+      <w:r>
+        <w:t>El botón "Importar desde Excel" en el plan de mesas sube la lista de invitados ya armada en una hoja de cálculo — mesa, nombre, apellido, familia, RSVP, plato principal, restricciones alimenticias, rol/parentesco, sexo y a quién invita (novio, novia o ambos) — en lugar de digitarla uno por uno.</w:t>
+      </w:r>
+    </w:p>
+    <w:p>
+      <w:pPr>
+        <w:pStyle w:val="Heading3"/>
+      </w:pPr>
+      <w:r>
+        <w:t>Captura rápida de invitados</w:t>
+      </w:r>
+    </w:p>
+    <w:p>
+      <w:r>
+        <w:t>Existe además una pantalla de captura rápida, pensada para ir agregando invitados uno tras otro sin tener que volver a la lista completa cada vez.</w:t>
       </w:r>
     </w:p>
     <w:p>
@@ -2633,6 +2874,16 @@
       </w:tr>
     </w:tbl>
     <w:p>
+      <w:r>
+        <w:t>En el reporte Minuto a minuto, el filtro de fecha/hora toma en cuenta tanto la fecha de la actividad del itinerario como la fecha propia de cada tarea relacionada (pueden ser distintas), y la sección ya no es de una en una: se pueden marcar varias secciones a la vez para verlas juntas. La columna Responsable muestra las iniciales de la persona en vez del nombre completo, para ocupar menos espacio.</w:t>
+      </w:r>
+    </w:p>
+    <w:p>
+      <w:r>
+        <w:t>El reporte de Cortejo nupcial también permite elegir una o varias listas a la vez (en vez de solo "todas" o una), tanto en pantalla como en la descarga a Excel.</w:t>
+      </w:r>
+    </w:p>
+    <w:p>
       <w:pPr>
         <w:pStyle w:val="Heading1"/>
         <w:spacing w:after="200" w:before="400"/>
@@ -2792,6 +3043,45 @@
       </w:pPr>
       <w:r>
         <w:t xml:space="preserve">Anular deja el registro (y su número de factura) para que el consecutivo no tenga huecos ni se pierda el rastro de que existió, solo marcada como inválida. Eliminar la borra por completo; se recomienda solo cuando la factura nunca debió generarse.</w:t>
+      </w:r>
+    </w:p>
+    <w:p>
+      <w:pPr>
+        <w:pStyle w:val="Heading3"/>
+      </w:pPr>
+      <w:r>
+        <w:t>¿Por qué no suena la alarma si me suscribí al calendario del guión?</w:t>
+      </w:r>
+    </w:p>
+    <w:p>
+      <w:r>
+        <w:t>Porque iPhone y Android no permiten alarmas en calendarios suscritos — es una limitación de esas plataformas, no del sistema. Para recibir la alarma, usa la opción "Descargar archivo .ics" e impórtala directamente al calendario, en vez de suscribirte.</w:t>
+      </w:r>
+    </w:p>
+    <w:p>
+      <w:pPr>
+        <w:pStyle w:val="Heading3"/>
+      </w:pPr>
+      <w:r>
+        <w:t>¿Qué le pasa a las tareas cuando elimino una cadena de tareas?</w:t>
+      </w:r>
+    </w:p>
+    <w:p>
+      <w:r>
+        <w:t>Nada: la cadena desaparece pero todas sus tareas siguen existiendo, sin cadena, exactamente como estaban (mismo responsable, fecha, evidencia y estado).</w:t>
+      </w:r>
+    </w:p>
+    <w:p>
+      <w:pPr>
+        <w:pStyle w:val="Heading3"/>
+      </w:pPr>
+      <w:r>
+        <w:t>¿Qué pasa con la categoría de una lista del cortejo cuando la elimino de un evento?</w:t>
+      </w:r>
+    </w:p>
+    <w:p>
+      <w:r>
+        <w:t>La categoría (por ejemplo "Boutonnieres") sigue existiendo y disponible para todos los eventos; solo se borran las personas que ese evento en particular tenía en esa lista.</w:t>
       </w:r>
     </w:p>
     <w:sectPr>
@@ -2806,7 +3096,11 @@
 </w:document>
 </file>
 
-<file path=word\endnotes.xml><?xml version="1.0" encoding="utf-8"?>
+<file path=word/comments.xml><?xml version="1.0" encoding="utf-8"?>
+<w:comments xmlns:cx="http://schemas.microsoft.com/office/drawing/2014/chartex" xmlns:cx1="http://schemas.microsoft.com/office/drawing/2015/9/8/chartex" xmlns:cx2="http://schemas.microsoft.com/office/drawing/2015/10/21/chartex" xmlns:cx3="http://schemas.microsoft.com/office/drawing/2016/5/9/chartex" xmlns:cx4="http://schemas.microsoft.com/office/drawing/2016/5/10/chartex" xmlns:cx5="http://schemas.microsoft.com/office/drawing/2016/5/11/chartex" xmlns:cx6="http://schemas.microsoft.com/office/drawing/2016/5/12/chartex" xmlns:cx7="http://schemas.microsoft.com/office/drawing/2016/5/13/chartex" xmlns:cx8="http://schemas.microsoft.com/office/drawing/2016/5/14/chartex" xmlns:mc="http://schemas.openxmlformats.org/markup-compatibility/2006" xmlns:aink="http://schemas.microsoft.com/office/drawing/2016/ink" xmlns:am3d="http://schemas.microsoft.com/office/drawing/2017/model3d" xmlns:o="urn:schemas-microsoft-com:office:office" xmlns:r="http://schemas.openxmlformats.org/officeDocument/2006/relationships" xmlns:m="http://schemas.openxmlformats.org/officeDocument/2006/math" xmlns:v="urn:schemas-microsoft-com:vml" xmlns:wp14="http://schemas.microsoft.com/office/word/2010/wordprocessingDrawing" xmlns:wp="http://schemas.openxmlformats.org/drawingml/2006/wordprocessingDrawing" xmlns:w10="urn:schemas-microsoft-com:office:word" xmlns:w="http://schemas.openxmlformats.org/wordprocessingml/2006/main" xmlns:w14="http://schemas.microsoft.com/office/word/2010/wordml" xmlns:w15="http://schemas.microsoft.com/office/word/2012/wordml" xmlns:w16cex="http://schemas.microsoft.com/office/word/2018/wordml/cex" xmlns:w16cid="http://schemas.microsoft.com/office/word/2016/wordml/cid" xmlns:w16="http://schemas.microsoft.com/office/word/2018/wordml" xmlns:w16sdtdh="http://schemas.microsoft.com/office/word/2020/wordml/sdtdatahash" xmlns:w16se="http://schemas.microsoft.com/office/word/2015/wordml/symex" xmlns:wpg="http://schemas.microsoft.com/office/word/2010/wordprocessingGroup" xmlns:wpi="http://schemas.microsoft.com/office/word/2010/wordprocessingInk" xmlns:wne="http://schemas.microsoft.com/office/word/2006/wordml" xmlns:wps="http://schemas.microsoft.com/office/word/2010/wordprocessingShape"/>
+</file>
+
+<file path=word/endnotes.xml><?xml version="1.0" encoding="utf-8"?>
 <w:endnotes xmlns:wpc="http://schemas.microsoft.com/office/word/2010/wordprocessingCanvas" xmlns:mc="http://schemas.openxmlformats.org/markup-compatibility/2006" xmlns:o="urn:schemas-microsoft-com:office:office" xmlns:r="http://schemas.openxmlformats.org/officeDocument/2006/relationships" xmlns:m="http://schemas.openxmlformats.org/officeDocument/2006/math" xmlns:v="urn:schemas-microsoft-com:vml" xmlns:wp14="http://schemas.microsoft.com/office/word/2010/wordprocessingDrawing" xmlns:wp="http://schemas.openxmlformats.org/drawingml/2006/wordprocessingDrawing" xmlns:w10="urn:schemas-microsoft-com:office:word" xmlns:w="http://schemas.openxmlformats.org/wordprocessingml/2006/main" xmlns:w14="http://schemas.microsoft.com/office/word/2010/wordml" xmlns:w15="http://schemas.microsoft.com/office/word/2012/wordml" xmlns:wpg="http://schemas.microsoft.com/office/word/2010/wordprocessingGroup" xmlns:wpi="http://schemas.microsoft.com/office/word/2010/wordprocessingInk" xmlns:wne="http://schemas.microsoft.com/office/word/2006/wordml" xmlns:wps="http://schemas.microsoft.com/office/word/2010/wordprocessingShape" mc:Ignorable="w14 w15 wp14">
   <w:endnote w:type="separator" w:id="-1">
     <w:p>
@@ -2843,11 +3137,7 @@
 </w:endnotes>
 </file>
 
-<file path=word\fontTable.xml><?xml version="1.0" encoding="utf-8"?>
-<w:fonts xmlns:mc="http://schemas.openxmlformats.org/markup-compatibility/2006" xmlns:r="http://schemas.openxmlformats.org/officeDocument/2006/relationships" xmlns:w="http://schemas.openxmlformats.org/wordprocessingml/2006/main" xmlns:w14="http://schemas.microsoft.com/office/word/2010/wordml" xmlns:w15="http://schemas.microsoft.com/office/word/2012/wordml" xmlns:w16cex="http://schemas.microsoft.com/office/word/2018/wordml/cex" xmlns:w16cid="http://schemas.microsoft.com/office/word/2016/wordml/cid" xmlns:w16="http://schemas.microsoft.com/office/word/2018/wordml" xmlns:w16sdtdh="http://schemas.microsoft.com/office/word/2020/wordml/sdtdatahash" xmlns:w16se="http://schemas.microsoft.com/office/word/2015/wordml/symex" mc:Ignorable="w14 w15 w16se w16cid w16 w16cex w16sdtdh"/>
-</file>
-
-<file path=word\footer1.xml><?xml version="1.0" encoding="utf-8"?>
+<file path=word/footer1.xml><?xml version="1.0" encoding="utf-8"?>
 <w:ftr xmlns:wpc="http://schemas.microsoft.com/office/word/2010/wordprocessingCanvas" xmlns:mc="http://schemas.openxmlformats.org/markup-compatibility/2006" xmlns:o="urn:schemas-microsoft-com:office:office" xmlns:r="http://schemas.openxmlformats.org/officeDocument/2006/relationships" xmlns:m="http://schemas.openxmlformats.org/officeDocument/2006/math" xmlns:v="urn:schemas-microsoft-com:vml" xmlns:wp14="http://schemas.microsoft.com/office/word/2010/wordprocessingDrawing" xmlns:wp="http://schemas.openxmlformats.org/drawingml/2006/wordprocessingDrawing" xmlns:w10="urn:schemas-microsoft-com:office:word" xmlns:w="http://schemas.openxmlformats.org/wordprocessingml/2006/main" xmlns:w14="http://schemas.microsoft.com/office/word/2010/wordml" xmlns:w15="http://schemas.microsoft.com/office/word/2012/wordml" xmlns:wpg="http://schemas.microsoft.com/office/word/2010/wordprocessingGroup" xmlns:wpi="http://schemas.microsoft.com/office/word/2010/wordprocessingInk" xmlns:wne="http://schemas.microsoft.com/office/word/2006/wordml" xmlns:wps="http://schemas.microsoft.com/office/word/2010/wordprocessingShape">
   <w:p>
     <w:pPr>
@@ -2895,7 +3185,7 @@
 </w:ftr>
 </file>
 
-<file path=word\footnotes.xml><?xml version="1.0" encoding="utf-8"?>
+<file path=word/footnotes.xml><?xml version="1.0" encoding="utf-8"?>
 <w:footnotes xmlns:wpc="http://schemas.microsoft.com/office/word/2010/wordprocessingCanvas" xmlns:mc="http://schemas.openxmlformats.org/markup-compatibility/2006" xmlns:o="urn:schemas-microsoft-com:office:office" xmlns:r="http://schemas.openxmlformats.org/officeDocument/2006/relationships" xmlns:m="http://schemas.openxmlformats.org/officeDocument/2006/math" xmlns:v="urn:schemas-microsoft-com:vml" xmlns:wp14="http://schemas.microsoft.com/office/word/2010/wordprocessingDrawing" xmlns:wp="http://schemas.openxmlformats.org/drawingml/2006/wordprocessingDrawing" xmlns:w10="urn:schemas-microsoft-com:office:word" xmlns:w="http://schemas.openxmlformats.org/wordprocessingml/2006/main" xmlns:w14="http://schemas.microsoft.com/office/word/2010/wordml" xmlns:w15="http://schemas.microsoft.com/office/word/2012/wordml" xmlns:wpg="http://schemas.microsoft.com/office/word/2010/wordprocessingGroup" xmlns:wpi="http://schemas.microsoft.com/office/word/2010/wordprocessingInk" xmlns:wne="http://schemas.microsoft.com/office/word/2006/wordml" xmlns:wps="http://schemas.microsoft.com/office/word/2010/wordprocessingShape" mc:Ignorable="w14 w15 wp14">
   <w:footnote w:type="separator" w:id="-1">
     <w:p>
@@ -2932,7 +3222,7 @@
 </w:footnotes>
 </file>
 
-<file path=word\header1.xml><?xml version="1.0" encoding="utf-8"?>
+<file path=word/header1.xml><?xml version="1.0" encoding="utf-8"?>
 <w:hdr xmlns:wpc="http://schemas.microsoft.com/office/word/2010/wordprocessingCanvas" xmlns:mc="http://schemas.openxmlformats.org/markup-compatibility/2006" xmlns:o="urn:schemas-microsoft-com:office:office" xmlns:r="http://schemas.openxmlformats.org/officeDocument/2006/relationships" xmlns:m="http://schemas.openxmlformats.org/officeDocument/2006/math" xmlns:v="urn:schemas-microsoft-com:vml" xmlns:wp14="http://schemas.microsoft.com/office/word/2010/wordprocessingDrawing" xmlns:wp="http://schemas.openxmlformats.org/drawingml/2006/wordprocessingDrawing" xmlns:w10="urn:schemas-microsoft-com:office:word" xmlns:w="http://schemas.openxmlformats.org/wordprocessingml/2006/main" xmlns:w14="http://schemas.microsoft.com/office/word/2010/wordml" xmlns:w15="http://schemas.microsoft.com/office/word/2012/wordml" xmlns:wpg="http://schemas.microsoft.com/office/word/2010/wordprocessingGroup" xmlns:wpi="http://schemas.microsoft.com/office/word/2010/wordprocessingInk" xmlns:wne="http://schemas.microsoft.com/office/word/2006/wordml" xmlns:wps="http://schemas.microsoft.com/office/word/2010/wordprocessingShape" xmlns:cx="http://schemas.microsoft.com/office/drawing/2014/chartex" xmlns:cx1="http://schemas.microsoft.com/office/drawing/2015/9/8/chartex" xmlns:cx2="http://schemas.microsoft.com/office/drawing/2015/10/21/chartex" xmlns:cx3="http://schemas.microsoft.com/office/drawing/2016/5/9/chartex" xmlns:cx4="http://schemas.microsoft.com/office/drawing/2016/5/10/chartex" xmlns:cx5="http://schemas.microsoft.com/office/drawing/2016/5/11/chartex" xmlns:cx6="http://schemas.microsoft.com/office/drawing/2016/5/12/chartex" xmlns:cx7="http://schemas.microsoft.com/office/drawing/2016/5/13/chartex" xmlns:cx8="http://schemas.microsoft.com/office/drawing/2016/5/14/chartex" xmlns:w16cid="http://schemas.microsoft.com/office/word/2016/wordml/cid" xmlns:w16se="http://schemas.microsoft.com/office/word/2015/wordml/symex">
   <w:p>
     <w:pPr>
@@ -2950,7 +3240,7 @@
 </w:hdr>
 </file>
 
-<file path=word\numbering.xml><?xml version="1.0" encoding="utf-8"?>
+<file path=word/numbering.xml><?xml version="1.0" encoding="utf-8"?>
 <w:numbering xmlns:wpc="http://schemas.microsoft.com/office/word/2010/wordprocessingCanvas" xmlns:mc="http://schemas.openxmlformats.org/markup-compatibility/2006" xmlns:o="urn:schemas-microsoft-com:office:office" xmlns:r="http://schemas.openxmlformats.org/officeDocument/2006/relationships" xmlns:m="http://schemas.openxmlformats.org/officeDocument/2006/math" xmlns:v="urn:schemas-microsoft-com:vml" xmlns:wp14="http://schemas.microsoft.com/office/word/2010/wordprocessingDrawing" xmlns:wp="http://schemas.openxmlformats.org/drawingml/2006/wordprocessingDrawing" xmlns:w10="urn:schemas-microsoft-com:office:word" xmlns:w="http://schemas.openxmlformats.org/wordprocessingml/2006/main" xmlns:w14="http://schemas.microsoft.com/office/word/2010/wordml" xmlns:w15="http://schemas.microsoft.com/office/word/2012/wordml" xmlns:wpg="http://schemas.microsoft.com/office/word/2010/wordprocessingGroup" xmlns:wpi="http://schemas.microsoft.com/office/word/2010/wordprocessingInk" xmlns:wne="http://schemas.microsoft.com/office/word/2006/wordml" xmlns:wps="http://schemas.microsoft.com/office/word/2010/wordprocessingShape" mc:Ignorable="w14 w15 wp14">
   <w:abstractNum w:abstractNumId="1" w15:restartNumberingAfterBreak="0">
     <w:multiLevelType w:val="hybridMultilevel"/>
@@ -3075,17 +3365,7 @@
 </w:numbering>
 </file>
 
-<file path=word\settings.xml><?xml version="1.0" encoding="utf-8"?>
-<w:settings xmlns:wpc="http://schemas.microsoft.com/office/word/2010/wordprocessingCanvas" xmlns:mc="http://schemas.openxmlformats.org/markup-compatibility/2006" xmlns:o="urn:schemas-microsoft-com:office:office" xmlns:r="http://schemas.openxmlformats.org/officeDocument/2006/relationships" xmlns:m="http://schemas.openxmlformats.org/officeDocument/2006/math" xmlns:v="urn:schemas-microsoft-com:vml" xmlns:wp14="http://schemas.microsoft.com/office/word/2010/wordprocessingDrawing" xmlns:wp="http://schemas.openxmlformats.org/drawingml/2006/wordprocessingDrawing" xmlns:w10="urn:schemas-microsoft-com:office:word" xmlns:w="http://schemas.openxmlformats.org/wordprocessingml/2006/main" xmlns:w14="http://schemas.microsoft.com/office/word/2010/wordml" xmlns:w15="http://schemas.microsoft.com/office/word/2012/wordml" xmlns:wpg="http://schemas.microsoft.com/office/word/2010/wordprocessingGroup" xmlns:wpi="http://schemas.microsoft.com/office/word/2010/wordprocessingInk" xmlns:wne="http://schemas.microsoft.com/office/word/2006/wordml" xmlns:wps="http://schemas.microsoft.com/office/word/2010/wordprocessingShape" mc:Ignorable="w14 w15 wp14">
-  <w:displayBackgroundShape/>
-  <w:evenAndOddHeaders w:val="false"/>
-  <w:compat>
-    <w:compatSetting w:val="15" w:name="compatibilityMode" w:uri="http://schemas.microsoft.com/office/word"/>
-  </w:compat>
-</w:settings>
-</file>
-
-<file path=word\styles.xml><?xml version="1.0" encoding="utf-8"?>
+<file path=word/styles.xml><?xml version="1.0" encoding="utf-8"?>
 <w:styles xmlns:mc="http://schemas.openxmlformats.org/markup-compatibility/2006" xmlns:r="http://schemas.openxmlformats.org/officeDocument/2006/relationships" xmlns:w="http://schemas.openxmlformats.org/wordprocessingml/2006/main" xmlns:w14="http://schemas.microsoft.com/office/word/2010/wordml" xmlns:w15="http://schemas.microsoft.com/office/word/2012/wordml" mc:Ignorable="w14 w15">
   <w:docDefaults>
     <w:rPrDefault>

</xml_diff>